<commit_message>
Update Stage 3 analysis with corrected model results
</commit_message>
<xml_diff>
--- a/analysis/Perfect Competition Stage 3 Analysis Draft.docx
+++ b/analysis/Perfect Competition Stage 3 Analysis Draft.docx
@@ -97,46 +97,57 @@
     </w:p>
     <w:p>
       <w:pPr>
-        <w:spacing w:before="100" w:beforeAutospacing="1" w:after="100" w:afterAutospacing="1" w:line="240" w:lineRule="auto"/>
-        <w:rPr>
-          <w:rFonts w:ascii="Times New Roman" w:eastAsia="Times New Roman" w:hAnsi="Times New Roman" w:cs="Times New Roman"/>
-          <w:kern w:val="0"/>
-          <w14:ligatures w14:val="none"/>
-        </w:rPr>
+        <w:pStyle w:val="p1"/>
       </w:pPr>
       <w:r>
-        <w:rPr>
-          <w:rFonts w:ascii="Times New Roman" w:eastAsia="Times New Roman" w:hAnsi="Times New Roman" w:cs="Times New Roman"/>
-          <w:kern w:val="0"/>
-          <w14:ligatures w14:val="none"/>
-        </w:rPr>
-        <w:t xml:space="preserve">The model showed that my hypothesis for a 9/11/29 allocation differed from the farm model. The model showed that the optimal allocation was 10 tomatoes, 20 carrots, and 30 mesclun. Furthermore, the model used 60 beds out of the 64 available beds. The season profit of $42,762 </w:t>
-      </w:r>
-      <w:r>
-        <w:rPr>
-          <w:rFonts w:ascii="Times New Roman" w:eastAsia="Times New Roman" w:hAnsi="Times New Roman" w:cs="Times New Roman"/>
-          <w:kern w:val="0"/>
-          <w14:ligatures w14:val="none"/>
-        </w:rPr>
-        <w:t>closely matches</w:t>
-      </w:r>
-      <w:r>
-        <w:rPr>
-          <w:rFonts w:ascii="Times New Roman" w:eastAsia="Times New Roman" w:hAnsi="Times New Roman" w:cs="Times New Roman"/>
-          <w:kern w:val="0"/>
-          <w14:ligatures w14:val="none"/>
-        </w:rPr>
-        <w:t xml:space="preserve"> with the model’s season profit of $42,775.16, with a difference of $13.16, possibly due to input precision or rounding. The farm plan guides the farmer in allocating resources to maximize profits and indicates when to stop adding beds once marginal costs exceed marginal revenue. </w:t>
-      </w:r>
-      <w:r>
-        <w:rPr>
-          <w:rFonts w:ascii="Times New Roman" w:eastAsia="Times New Roman" w:hAnsi="Times New Roman" w:cs="Times New Roman"/>
+        <w:t>The model showed that my hypothesis for a 9/11/29 allocation differed from the farm model. The model showed that the optimal allocation was 10 tomatoes, 20 carrots, and 30 mesclun. Furthermore, the model used 60 beds out of the 64 available beds.</w:t>
+      </w:r>
+      <w:r>
+        <w:t xml:space="preserve"> </w:t>
+      </w:r>
+      <w:r>
+        <w:t xml:space="preserve">The model showed a season profit of </w:t>
+      </w:r>
+      <w:r>
+        <w:rPr>
+          <w:rStyle w:val="s1"/>
           <w:b/>
           <w:bCs/>
-          <w:kern w:val="0"/>
-          <w14:ligatures w14:val="none"/>
-        </w:rPr>
-        <w:t>Figure 1 shows the Solver’s optimal crop allocation, season profit, and the status of the farm’s constraints.</w:t>
+        </w:rPr>
+        <w:t>$42,761.66</w:t>
+      </w:r>
+      <w:r>
+        <w:t xml:space="preserve">, which matches the published check figure of approximately </w:t>
+      </w:r>
+      <w:r>
+        <w:rPr>
+          <w:rStyle w:val="s1"/>
+          <w:b/>
+          <w:bCs/>
+        </w:rPr>
+        <w:t>$42,762</w:t>
+      </w:r>
+      <w:r>
+        <w:t xml:space="preserve"> when rounded to the nearest dollar. This confirms that the model reproduces the published profit result using the specified input precision.</w:t>
+      </w:r>
+    </w:p>
+    <w:p>
+      <w:pPr>
+        <w:pStyle w:val="p1"/>
+      </w:pPr>
+      <w:r>
+        <w:t xml:space="preserve">The farm plan guides the farmer in allocating resources to maximize </w:t>
+      </w:r>
+      <w:r>
+        <w:rPr>
+          <w:rStyle w:val="s1"/>
+          <w:b/>
+          <w:bCs/>
+        </w:rPr>
+        <w:t>season profit</w:t>
+      </w:r>
+      <w:r>
+        <w:t xml:space="preserve"> and indicates when to stop adding beds once marginal cost exceeds marginal revenue.</w:t>
       </w:r>
     </w:p>
     <w:p>
@@ -144,44 +155,73 @@
         <w:spacing w:before="100" w:beforeAutospacing="1" w:after="100" w:afterAutospacing="1" w:line="240" w:lineRule="auto"/>
         <w:rPr>
           <w:rFonts w:ascii="Times New Roman" w:eastAsia="Times New Roman" w:hAnsi="Times New Roman" w:cs="Times New Roman"/>
-          <w:i/>
-          <w:iCs/>
-          <w:kern w:val="0"/>
-          <w14:ligatures w14:val="none"/>
-        </w:rPr>
-      </w:pPr>
-      <w:r>
-        <w:rPr>
-          <w:rFonts w:ascii="Times New Roman" w:eastAsia="Times New Roman" w:hAnsi="Times New Roman" w:cs="Times New Roman"/>
           <w:b/>
           <w:bCs/>
           <w:kern w:val="0"/>
           <w14:ligatures w14:val="none"/>
         </w:rPr>
-        <w:t>Figure 1. Solver Optimal Farm Allocation</w:t>
-      </w:r>
-      <w:r>
-        <w:rPr>
-          <w:rFonts w:ascii="Times New Roman" w:eastAsia="Times New Roman" w:hAnsi="Times New Roman" w:cs="Times New Roman"/>
-          <w:kern w:val="0"/>
-          <w14:ligatures w14:val="none"/>
-        </w:rPr>
-        <w:br/>
-      </w:r>
-      <w:r>
-        <w:rPr>
-          <w:rFonts w:ascii="Times New Roman" w:eastAsia="Times New Roman" w:hAnsi="Times New Roman" w:cs="Times New Roman"/>
-          <w:i/>
-          <w:iCs/>
+      </w:pPr>
+      <w:r>
+        <w:rPr>
+          <w:rFonts w:ascii="Times New Roman" w:eastAsia="Times New Roman" w:hAnsi="Times New Roman" w:cs="Times New Roman"/>
+          <w:b/>
+          <w:bCs/>
+          <w:kern w:val="0"/>
+          <w14:ligatures w14:val="none"/>
+        </w:rPr>
+        <w:t>F</w:t>
+      </w:r>
+      <w:r>
+        <w:rPr>
+          <w:rFonts w:ascii="Times New Roman" w:eastAsia="Times New Roman" w:hAnsi="Times New Roman" w:cs="Times New Roman"/>
+          <w:b/>
+          <w:bCs/>
+          <w:kern w:val="0"/>
+          <w14:ligatures w14:val="none"/>
+        </w:rPr>
+        <w:t xml:space="preserve">igure </w:t>
+      </w:r>
+      <w:r>
+        <w:rPr>
+          <w:rFonts w:ascii="Times New Roman" w:eastAsia="Times New Roman" w:hAnsi="Times New Roman" w:cs="Times New Roman"/>
+          <w:b/>
+          <w:bCs/>
+          <w:kern w:val="0"/>
+          <w14:ligatures w14:val="none"/>
+        </w:rPr>
+        <w:t>1 shows the Solver’s optimal crop allocation, season profit, and the status of the farm’s constraints.</w:t>
+      </w:r>
+    </w:p>
+    <w:p>
+      <w:pPr>
+        <w:spacing w:before="100" w:beforeAutospacing="1" w:after="100" w:afterAutospacing="1" w:line="240" w:lineRule="auto"/>
+        <w:rPr>
+          <w:rFonts w:ascii="Times New Roman" w:eastAsia="Times New Roman" w:hAnsi="Times New Roman" w:cs="Times New Roman"/>
+          <w:kern w:val="0"/>
+          <w14:ligatures w14:val="none"/>
+        </w:rPr>
+      </w:pPr>
+    </w:p>
+    <w:p>
+      <w:pPr>
+        <w:spacing w:before="100" w:beforeAutospacing="1" w:after="100" w:afterAutospacing="1" w:line="240" w:lineRule="auto"/>
+        <w:rPr>
+          <w:rFonts w:ascii="Times New Roman" w:eastAsia="Times New Roman" w:hAnsi="Times New Roman" w:cs="Times New Roman"/>
+          <w:kern w:val="0"/>
+          <w14:ligatures w14:val="none"/>
+        </w:rPr>
+      </w:pPr>
+      <w:r>
+        <w:rPr>
+          <w:rFonts w:ascii="Times New Roman" w:eastAsia="Times New Roman" w:hAnsi="Times New Roman" w:cs="Times New Roman"/>
           <w:noProof/>
           <w:kern w:val="0"/>
-          <w14:ligatures w14:val="none"/>
         </w:rPr>
         <w:drawing>
-          <wp:inline distT="0" distB="0" distL="0" distR="0" wp14:anchorId="02B4D74A" wp14:editId="5263E4FC">
-            <wp:extent cx="5943600" cy="2167255"/>
-            <wp:effectExtent l="0" t="0" r="0" b="4445"/>
-            <wp:docPr id="339380123" name="Picture 1"/>
+          <wp:inline distT="0" distB="0" distL="0" distR="0" wp14:anchorId="7D0C4003" wp14:editId="76A8086C">
+            <wp:extent cx="5943600" cy="3343275"/>
+            <wp:effectExtent l="0" t="0" r="0" b="0"/>
+            <wp:docPr id="1986473380" name="Picture 2"/>
             <wp:cNvGraphicFramePr>
               <a:graphicFrameLocks xmlns:a="http://schemas.openxmlformats.org/drawingml/2006/main" noChangeAspect="1"/>
             </wp:cNvGraphicFramePr>
@@ -189,11 +229,17 @@
               <a:graphicData uri="http://schemas.openxmlformats.org/drawingml/2006/picture">
                 <pic:pic xmlns:pic="http://schemas.openxmlformats.org/drawingml/2006/picture">
                   <pic:nvPicPr>
-                    <pic:cNvPr id="339380123" name=""/>
+                    <pic:cNvPr id="1986473380" name="Picture 1986473380"/>
                     <pic:cNvPicPr/>
                   </pic:nvPicPr>
                   <pic:blipFill>
-                    <a:blip r:embed="rId4"/>
+                    <a:blip r:embed="rId4" cstate="print">
+                      <a:extLst>
+                        <a:ext uri="{28A0092B-C50C-407E-A947-70E740481C1C}">
+                          <a14:useLocalDpi xmlns:a14="http://schemas.microsoft.com/office/drawing/2010/main" val="0"/>
+                        </a:ext>
+                      </a:extLst>
+                    </a:blip>
                     <a:stretch>
                       <a:fillRect/>
                     </a:stretch>
@@ -201,7 +247,7 @@
                   <pic:spPr>
                     <a:xfrm>
                       <a:off x="0" y="0"/>
-                      <a:ext cx="5943600" cy="2167255"/>
+                      <a:ext cx="5943600" cy="3343275"/>
                     </a:xfrm>
                     <a:prstGeom prst="rect">
                       <a:avLst/>
@@ -223,32 +269,12 @@
           <w14:ligatures w14:val="none"/>
         </w:rPr>
       </w:pPr>
-      <w:r>
-        <w:rPr>
-          <w:rFonts w:ascii="Times New Roman" w:eastAsia="Times New Roman" w:hAnsi="Times New Roman" w:cs="Times New Roman"/>
-          <w:kern w:val="0"/>
-          <w14:ligatures w14:val="none"/>
-        </w:rPr>
-        <w:t xml:space="preserve">The farmer should stop growing additional tomatoes after 10 beds because marginal profit declines due to higher costs. The marginal profit from growing the 10th bed is approximately $551. The marginal profit from growing the 11th bed is approximately −$591. In perfect competition, the farmer cannot control prices because the farmer is a price taker. The farmer should continue adding production while marginal revenue is greater than marginal cost. </w:t>
-      </w:r>
-      <w:r>
-        <w:rPr>
-          <w:rFonts w:ascii="Times New Roman" w:eastAsia="Times New Roman" w:hAnsi="Times New Roman" w:cs="Times New Roman"/>
-          <w:b/>
-          <w:bCs/>
-          <w:kern w:val="0"/>
-          <w14:ligatures w14:val="none"/>
-        </w:rPr>
-        <w:t>As shown in Figure 2, the marginal profit becomes negative with the 11th tomato bed when marginal cost exceeds marginal revenue.</w:t>
-      </w:r>
     </w:p>
     <w:p>
       <w:pPr>
         <w:spacing w:before="100" w:beforeAutospacing="1" w:after="100" w:afterAutospacing="1" w:line="240" w:lineRule="auto"/>
         <w:rPr>
           <w:rFonts w:ascii="Times New Roman" w:eastAsia="Times New Roman" w:hAnsi="Times New Roman" w:cs="Times New Roman"/>
-          <w:b/>
-          <w:bCs/>
           <w:kern w:val="0"/>
           <w14:ligatures w14:val="none"/>
         </w:rPr>
@@ -256,39 +282,25 @@
     </w:p>
     <w:p>
       <w:pPr>
-        <w:spacing w:before="100" w:beforeAutospacing="1" w:after="100" w:afterAutospacing="1" w:line="240" w:lineRule="auto"/>
-        <w:rPr>
-          <w:rFonts w:ascii="Times New Roman" w:eastAsia="Times New Roman" w:hAnsi="Times New Roman" w:cs="Times New Roman"/>
+        <w:pStyle w:val="p1"/>
+      </w:pPr>
+      <w:r>
+        <w:lastRenderedPageBreak/>
+        <w:t>The farmer should stop growing additional tomatoes after 10 beds because marginal profit becomes negative as marginal cost exceeds marginal revenue.</w:t>
+      </w:r>
+      <w:r>
+        <w:t xml:space="preserve"> </w:t>
+      </w:r>
+      <w:r>
+        <w:t xml:space="preserve">The marginal profit from growing the 10th bed is approximately $551. The marginal profit from growing the 11th bed is approximately −$591. In perfect competition, the farmer cannot control prices because the farmer is a price taker. The farmer should continue adding production while marginal revenue is greater than marginal cost. </w:t>
+      </w:r>
+      <w:r>
+        <w:rPr>
           <w:b/>
           <w:bCs/>
-          <w:kern w:val="0"/>
-          <w14:ligatures w14:val="none"/>
-        </w:rPr>
-      </w:pPr>
-    </w:p>
-    <w:p>
-      <w:pPr>
-        <w:spacing w:before="100" w:beforeAutospacing="1" w:after="100" w:afterAutospacing="1" w:line="240" w:lineRule="auto"/>
-        <w:rPr>
-          <w:rFonts w:ascii="Times New Roman" w:eastAsia="Times New Roman" w:hAnsi="Times New Roman" w:cs="Times New Roman"/>
-          <w:b/>
-          <w:bCs/>
-          <w:kern w:val="0"/>
-          <w14:ligatures w14:val="none"/>
-        </w:rPr>
-      </w:pPr>
-    </w:p>
-    <w:p>
-      <w:pPr>
-        <w:spacing w:before="100" w:beforeAutospacing="1" w:after="100" w:afterAutospacing="1" w:line="240" w:lineRule="auto"/>
-        <w:rPr>
-          <w:rFonts w:ascii="Times New Roman" w:eastAsia="Times New Roman" w:hAnsi="Times New Roman" w:cs="Times New Roman"/>
-          <w:b/>
-          <w:bCs/>
-          <w:kern w:val="0"/>
-          <w14:ligatures w14:val="none"/>
-        </w:rPr>
-      </w:pPr>
+        </w:rPr>
+        <w:t>As shown in Figure 2, the marginal profit becomes negative with the 11th tomato bed when marginal cost exceeds marginal revenue.</w:t>
+      </w:r>
     </w:p>
     <w:p>
       <w:pPr>
@@ -415,104 +427,57 @@
     </w:p>
     <w:p>
       <w:pPr>
-        <w:spacing w:before="100" w:beforeAutospacing="1" w:after="100" w:afterAutospacing="1" w:line="240" w:lineRule="auto"/>
-        <w:rPr>
-          <w:rFonts w:ascii="Times New Roman" w:eastAsia="Times New Roman" w:hAnsi="Times New Roman" w:cs="Times New Roman"/>
-          <w:kern w:val="0"/>
-          <w14:ligatures w14:val="none"/>
-        </w:rPr>
+        <w:pStyle w:val="p1"/>
       </w:pPr>
       <w:r>
-        <w:rPr>
-          <w:rFonts w:ascii="Times New Roman" w:eastAsia="Times New Roman" w:hAnsi="Times New Roman" w:cs="Times New Roman"/>
-          <w:kern w:val="0"/>
-          <w14:ligatures w14:val="none"/>
-        </w:rPr>
         <w:t xml:space="preserve">The Solver stops growing carrots at 20 beds and mesclun at 30 beds due to binding constraints. </w:t>
       </w:r>
       <w:r>
-        <w:rPr>
-          <w:rFonts w:ascii="Times New Roman" w:eastAsia="Times New Roman" w:hAnsi="Times New Roman" w:cs="Times New Roman"/>
-          <w:kern w:val="0"/>
-          <w14:ligatures w14:val="none"/>
-        </w:rPr>
         <w:t>The tomato constraint</w:t>
       </w:r>
       <w:r>
-        <w:rPr>
-          <w:rFonts w:ascii="Times New Roman" w:eastAsia="Times New Roman" w:hAnsi="Times New Roman" w:cs="Times New Roman"/>
-          <w:kern w:val="0"/>
-          <w14:ligatures w14:val="none"/>
-        </w:rPr>
-        <w:t xml:space="preserve"> is slack, but growing beyond 10 beds results in negative marginal profit. Given shadow values of approximately $352 for carrots and $246 for mesclun, if these constraints were relaxed, growing one additional unit of carrots beyond 20 beds would result in approximately $352 in additional profit. This is approximately $106 more than the marginal value of relaxing the mesclun constraint.</w:t>
+        <w:t xml:space="preserve"> is slack, but growing beyond 10 beds results in negative marginal profit. </w:t>
+      </w:r>
+      <w:r>
+        <w:t>Given shadow values of approximately $352 for carrots and $246 for mesclun, if these constraints were relaxed, allowing one additional carrot bed beyond 20 would increase profit by approximately $352.</w:t>
+      </w:r>
+      <w:r>
+        <w:t xml:space="preserve"> </w:t>
+      </w:r>
+      <w:r>
+        <w:t>This is approximately $106 more than the marginal value of relaxing the mesclun constraint.</w:t>
       </w:r>
     </w:p>
     <w:p>
       <w:pPr>
-        <w:spacing w:before="100" w:beforeAutospacing="1" w:after="100" w:afterAutospacing="1" w:line="240" w:lineRule="auto"/>
-        <w:rPr>
-          <w:rFonts w:ascii="Times New Roman" w:eastAsia="Times New Roman" w:hAnsi="Times New Roman" w:cs="Times New Roman"/>
-          <w:kern w:val="0"/>
-          <w14:ligatures w14:val="none"/>
-        </w:rPr>
+        <w:pStyle w:val="p1"/>
       </w:pPr>
       <w:r>
-        <w:rPr>
-          <w:rFonts w:ascii="Times New Roman" w:eastAsia="Times New Roman" w:hAnsi="Times New Roman" w:cs="Times New Roman"/>
-          <w:kern w:val="0"/>
-          <w14:ligatures w14:val="none"/>
-        </w:rPr>
-        <w:t xml:space="preserve">It would still make economic sense to grow a crop provided that its marginal revenue is not less than its marginal cost. If MR &gt; MC, then plant the </w:t>
-      </w:r>
-      <w:r>
-        <w:rPr>
-          <w:rFonts w:ascii="Times New Roman" w:eastAsia="Times New Roman" w:hAnsi="Times New Roman" w:cs="Times New Roman"/>
-          <w:kern w:val="0"/>
-          <w14:ligatures w14:val="none"/>
-        </w:rPr>
-        <w:t>additional bed</w:t>
-      </w:r>
-      <w:r>
-        <w:rPr>
-          <w:rFonts w:ascii="Times New Roman" w:eastAsia="Times New Roman" w:hAnsi="Times New Roman" w:cs="Times New Roman"/>
-          <w:kern w:val="0"/>
-          <w14:ligatures w14:val="none"/>
-        </w:rPr>
-        <w:t xml:space="preserve"> but if MR &lt; MC, then do not plant the additional</w:t>
-      </w:r>
-      <w:r>
-        <w:rPr>
-          <w:rFonts w:ascii="Times New Roman" w:eastAsia="Times New Roman" w:hAnsi="Times New Roman" w:cs="Times New Roman"/>
-          <w:kern w:val="0"/>
-          <w14:ligatures w14:val="none"/>
-        </w:rPr>
-        <w:t xml:space="preserve"> bed </w:t>
-      </w:r>
-      <w:r>
-        <w:rPr>
-          <w:rFonts w:ascii="Times New Roman" w:eastAsia="Times New Roman" w:hAnsi="Times New Roman" w:cs="Times New Roman"/>
-          <w:kern w:val="0"/>
-          <w14:ligatures w14:val="none"/>
-        </w:rPr>
-        <w:t>. Fixed costs need to be paid whether crops are grown. If the crops generate money after subtracting variable costs from revenue, that contribution margin can be used to help pay the fixed costs.</w:t>
+        <w:t>It would make economic sense to add another bed provided that marginal revenue exceeds marginal cost. If MR &gt; MC, plant the additional bed; if MR &lt; MC, do not add the bed. Fixed costs must be paid regardless of production. If a crop generates positive contribution margin after variable costs are subtracted from revenue, that contribution can help cover fixed costs.</w:t>
       </w:r>
     </w:p>
     <w:p>
       <w:pPr>
-        <w:spacing w:before="100" w:beforeAutospacing="1" w:after="100" w:afterAutospacing="1" w:line="240" w:lineRule="auto"/>
-        <w:rPr>
-          <w:rFonts w:ascii="Times New Roman" w:eastAsia="Times New Roman" w:hAnsi="Times New Roman" w:cs="Times New Roman"/>
-          <w:kern w:val="0"/>
-          <w14:ligatures w14:val="none"/>
-        </w:rPr>
+        <w:pStyle w:val="p1"/>
       </w:pPr>
       <w:r>
-        <w:rPr>
-          <w:rFonts w:ascii="Times New Roman" w:eastAsia="Times New Roman" w:hAnsi="Times New Roman" w:cs="Times New Roman"/>
-          <w:kern w:val="0"/>
-          <w14:ligatures w14:val="none"/>
-        </w:rPr>
-        <w:t>My hypothesis of 9 tomatoes, 11 carrots, and 29 mesclun differed from the farm model because I was focused on the costs associated with expanding the crop beds. This made me hesitant about expanding the farm beds and resulted in a reduced allocation of crops, such as recommending 11 carrot beds versus Solver’s 20 beds. Using marginal analysis clarified the marginal revenue versus marginal cost relationship when growing additional crops. On the surface, the higher costs made me hesitant to expand production, but recognizing when marginal revenue is greater than marginal cost provides guidance that growing more could be profitable. Had I followed my hypothesis of growing only 11 carrot beds, I would have missed the opportunity to maximize profits.</w:t>
+        <w:t xml:space="preserve">My hypothesis of 9 tomatoes, 11 carrots, and 29 mesclun differed from the farm model because I was focused on the costs associated with expanding the crop beds. </w:t>
+      </w:r>
+      <w:r>
+        <w:t xml:space="preserve">This made me hesitant about expanding production and resulted in a lower crop allocation, such as recommending 11 carrot </w:t>
+      </w:r>
+      <w:r>
+        <w:lastRenderedPageBreak/>
+        <w:t xml:space="preserve">beds rather than Solver’s 20 </w:t>
+      </w:r>
+      <w:r>
+        <w:t>beds.</w:t>
+      </w:r>
+      <w:r>
+        <w:t xml:space="preserve"> Using</w:t>
+      </w:r>
+      <w:r>
+        <w:t xml:space="preserve"> marginal analysis clarified the marginal revenue versus marginal cost relationship when growing additional crops. On the surface, the higher costs made me hesitant to expand production, but recognizing when marginal revenue is greater than marginal cost provides guidance that growing more could be profitable. Had I followed my hypothesis of growing only 11 carrot beds, I would have missed the opportunity to maximize profits.</w:t>
       </w:r>
     </w:p>
     <w:p/>
@@ -1127,7 +1092,6 @@
   <w:style w:type="character" w:default="1" w:styleId="DefaultParagraphFont">
     <w:name w:val="Default Paragraph Font"/>
     <w:uiPriority w:val="1"/>
-    <w:semiHidden/>
     <w:unhideWhenUsed/>
   </w:style>
   <w:style w:type="table" w:default="1" w:styleId="TableNormal">
@@ -1482,6 +1446,38 @@
       <w:kern w:val="0"/>
       <w14:ligatures w14:val="none"/>
     </w:rPr>
+  </w:style>
+  <w:style w:type="paragraph" w:customStyle="1" w:styleId="p1">
+    <w:name w:val="p1"/>
+    <w:basedOn w:val="Normal"/>
+    <w:rsid w:val="002F0889"/>
+    <w:pPr>
+      <w:spacing w:before="100" w:beforeAutospacing="1" w:after="100" w:afterAutospacing="1" w:line="240" w:lineRule="auto"/>
+    </w:pPr>
+    <w:rPr>
+      <w:rFonts w:ascii="Times New Roman" w:eastAsia="Times New Roman" w:hAnsi="Times New Roman" w:cs="Times New Roman"/>
+      <w:kern w:val="0"/>
+      <w14:ligatures w14:val="none"/>
+    </w:rPr>
+  </w:style>
+  <w:style w:type="table" w:styleId="TableGrid">
+    <w:name w:val="Table Grid"/>
+    <w:basedOn w:val="TableNormal"/>
+    <w:uiPriority w:val="39"/>
+    <w:rsid w:val="0055397B"/>
+    <w:pPr>
+      <w:spacing w:after="0" w:line="240" w:lineRule="auto"/>
+    </w:pPr>
+    <w:tblPr>
+      <w:tblBorders>
+        <w:top w:val="single" w:sz="4" w:space="0" w:color="auto"/>
+        <w:left w:val="single" w:sz="4" w:space="0" w:color="auto"/>
+        <w:bottom w:val="single" w:sz="4" w:space="0" w:color="auto"/>
+        <w:right w:val="single" w:sz="4" w:space="0" w:color="auto"/>
+        <w:insideH w:val="single" w:sz="4" w:space="0" w:color="auto"/>
+        <w:insideV w:val="single" w:sz="4" w:space="0" w:color="auto"/>
+      </w:tblBorders>
+    </w:tblPr>
   </w:style>
 </w:styles>
 </file>

</xml_diff>